<commit_message>
Expand PTS-1 annexures into editable templates
Co-authored-by: Delroy Martins <delrockz@users.noreply.github.com>
</commit_message>
<xml_diff>
--- a/deliverables/PTS-1_Salugara_Monastery_Project.docx
+++ b/deliverables/PTS-1_Salugara_Monastery_Project.docx
@@ -2358,7 +2358,7 @@
           <w:b w:val="0"/>
           <w:sz w:val="24"/>
         </w:rPr>
-        <w:t>Annexure A: Survey Questionnaire (Visitor) Section 1: Profile (age group, state/country, visit type, travel companion) Section 2: Motivation (religious, cultural, peace, architecture, transit stop) Section 3: Site Experience (cleanliness, signage, behaviour guidance, safety, ambience) Section 4: Expenditure (food, transport, local purchases, accommodation) Section 5: Improvement Priorities (interpretation, toilets, parking, digital information, guides) Section 6: Open Comment (what should be preserved at any cost)</w:t>
+        <w:t>Annexure A: Visitor Questionnaire - Blank Field Format (PTS-1)</w:t>
       </w:r>
     </w:p>
     <w:p>
@@ -2372,7 +2372,7 @@
           <w:b w:val="0"/>
           <w:sz w:val="24"/>
         </w:rPr>
-        <w:t>Annexure B: Interview Guide (Monastic/Management Stakeholders) - Perceived changes in visitor profile over time - Boundaries between spiritual function and tourism function - Festival management and crowd behaviour - Interpretation opportunities and concerns - Partnerships desired with local authorities and tourism bodies</w:t>
+        <w:t>A1. Respondent Background 1. Date of visit: ____________________ 2. Place of interaction: ____________________ 3. Age group: 18-25 / 26-35 / 36-45 / 46-60 / 60+ 4. Gender (optional): ____________________ 5. Place of origin (state/country): ____________________ 6. Visit type: First visit / Repeat visit 7. Travel mode: Solo / Family / Friends / Group / Pilgrimage group</w:t>
       </w:r>
     </w:p>
     <w:p>
@@ -2386,7 +2386,7 @@
           <w:b w:val="0"/>
           <w:sz w:val="24"/>
         </w:rPr>
-        <w:t>Annexure C: Interview Guide (Local Businesses and Residents) - Seasonal demand pattern - Price sensitivity and spending behaviour - Infrastructure bottlenecks - Tourism benefits and social concerns - Suggestions for balanced development</w:t>
+        <w:t>A2. Purpose and Motivation 1. Primary reason for visit: Religious devotion / Cultural interest / Peace and meditation / Architecture curiosity / Transit stop 2. Secondary reason (if any): ____________________ 3. Did you know about nearby Buddhist monasteries before this visit? Yes / No / Not sure</w:t>
       </w:r>
     </w:p>
     <w:p>
@@ -2400,7 +2400,231 @@
           <w:b w:val="0"/>
           <w:sz w:val="24"/>
         </w:rPr>
-        <w:t>Annexure D: Observation Checklist - Access roads and directional signage - Entry experience and orientation support - Site cleanliness and waste handling - Visitor etiquette compliance - Cultural information visibility - Nearby service support</w:t>
+        <w:t>A3. Experience Assessment (Rate 1-5) 1. Site cleanliness: ____ 2. Signage and route clarity: ____ 3. Guidance on visitor behaviour: ____ 4. Overall peace and spiritual ambience: ____ 5. Cultural information availability: ____</w:t>
+      </w:r>
+    </w:p>
+    <w:p>
+      <w:pPr>
+        <w:spacing w:line="360" w:lineRule="auto" w:after="160"/>
+        <w:jc w:val="both"/>
+      </w:pPr>
+      <w:r>
+        <w:rPr>
+          <w:rFonts w:ascii="Times New Roman" w:hAnsi="Times New Roman"/>
+          <w:b w:val="0"/>
+          <w:sz w:val="24"/>
+        </w:rPr>
+        <w:t>A4. Expenditure and Stay Pattern 1. Approximate local spend (food/transport/retail): ____________________ 2. Time spent at site: Less than 30 min / 30-60 min / 1-2 hrs / More than 2 hrs 3. Would you include this site in a wider monastery circuit? Yes / No / Maybe</w:t>
+      </w:r>
+    </w:p>
+    <w:p>
+      <w:pPr>
+        <w:spacing w:line="360" w:lineRule="auto" w:after="160"/>
+        <w:jc w:val="both"/>
+      </w:pPr>
+      <w:r>
+        <w:rPr>
+          <w:rFonts w:ascii="Times New Roman" w:hAnsi="Times New Roman"/>
+          <w:b w:val="0"/>
+          <w:sz w:val="24"/>
+        </w:rPr>
+        <w:t>A5. Improvement Inputs 1. Most needed improvement at this site: ____________________ 2. What should be preserved at any cost? ____________________ 3. Any additional comment: ____________________</w:t>
+      </w:r>
+    </w:p>
+    <w:p>
+      <w:pPr>
+        <w:spacing w:line="360" w:lineRule="auto" w:after="160"/>
+        <w:jc w:val="both"/>
+      </w:pPr>
+      <w:r>
+        <w:rPr>
+          <w:rFonts w:ascii="Times New Roman" w:hAnsi="Times New Roman"/>
+          <w:b w:val="0"/>
+          <w:sz w:val="24"/>
+        </w:rPr>
+        <w:t>Annexure B: Interview Schedule - Monastic/Management Stakeholders (Blank Format)</w:t>
+      </w:r>
+    </w:p>
+    <w:p>
+      <w:pPr>
+        <w:spacing w:line="360" w:lineRule="auto" w:after="160"/>
+        <w:jc w:val="both"/>
+      </w:pPr>
+      <w:r>
+        <w:rPr>
+          <w:rFonts w:ascii="Times New Roman" w:hAnsi="Times New Roman"/>
+          <w:b w:val="0"/>
+          <w:sz w:val="24"/>
+        </w:rPr>
+        <w:t>B1. Respondent Details 1. Name/role (optional): ____________________ 2. Institution/department: ____________________ 3. Date of interview: ____________________ 4. Place of interview: ____________________</w:t>
+      </w:r>
+    </w:p>
+    <w:p>
+      <w:pPr>
+        <w:spacing w:line="360" w:lineRule="auto" w:after="160"/>
+        <w:jc w:val="both"/>
+      </w:pPr>
+      <w:r>
+        <w:rPr>
+          <w:rFonts w:ascii="Times New Roman" w:hAnsi="Times New Roman"/>
+          <w:b w:val="0"/>
+          <w:sz w:val="24"/>
+        </w:rPr>
+        <w:t>B2. Core Interview Prompts 1. How has visitor profile changed in recent years? 2. How does the monastery balance sacred function and tourism function? 3. Which visitor behaviours create concern during peak periods? 4. What interpretation support is currently available for first-time visitors? 5. Which infrastructure gaps most affect visitor experience? 6. How can local stakeholders support respectful tourism growth? 7. What are key priorities for future planning?</w:t>
+      </w:r>
+    </w:p>
+    <w:p>
+      <w:pPr>
+        <w:spacing w:line="360" w:lineRule="auto" w:after="160"/>
+        <w:jc w:val="both"/>
+      </w:pPr>
+      <w:r>
+        <w:rPr>
+          <w:rFonts w:ascii="Times New Roman" w:hAnsi="Times New Roman"/>
+          <w:b w:val="0"/>
+          <w:sz w:val="24"/>
+        </w:rPr>
+        <w:t>B3. Interview Notes - Key statement(s): ____________________ - Researcher interpretation note: ____________________</w:t>
+      </w:r>
+    </w:p>
+    <w:p>
+      <w:pPr>
+        <w:spacing w:line="360" w:lineRule="auto" w:after="160"/>
+        <w:jc w:val="both"/>
+      </w:pPr>
+      <w:r>
+        <w:rPr>
+          <w:rFonts w:ascii="Times New Roman" w:hAnsi="Times New Roman"/>
+          <w:b w:val="0"/>
+          <w:sz w:val="24"/>
+        </w:rPr>
+        <w:t>Annexure C: Interview Schedule - Local Businesses and Residents (Blank Format)</w:t>
+      </w:r>
+    </w:p>
+    <w:p>
+      <w:pPr>
+        <w:spacing w:line="360" w:lineRule="auto" w:after="160"/>
+        <w:jc w:val="both"/>
+      </w:pPr>
+      <w:r>
+        <w:rPr>
+          <w:rFonts w:ascii="Times New Roman" w:hAnsi="Times New Roman"/>
+          <w:b w:val="0"/>
+          <w:sz w:val="24"/>
+        </w:rPr>
+        <w:t>C1. Respondent Details 1. Name/role (optional): ____________________ 2. Business/community type: ____________________ 3. Location: ____________________ 4. Date of interaction: ____________________</w:t>
+      </w:r>
+    </w:p>
+    <w:p>
+      <w:pPr>
+        <w:spacing w:line="360" w:lineRule="auto" w:after="160"/>
+        <w:jc w:val="both"/>
+      </w:pPr>
+      <w:r>
+        <w:rPr>
+          <w:rFonts w:ascii="Times New Roman" w:hAnsi="Times New Roman"/>
+          <w:b w:val="0"/>
+          <w:sz w:val="24"/>
+        </w:rPr>
+        <w:t>C2. Discussion Prompts 1. What seasonal demand patterns are observed around monastery tourism? 2. Which spending categories are most common among visitors? 3. What service/infrastructure bottlenecks are frequently noticed? 4. What benefits does the community receive from visitor flow? 5. What social or environmental concerns are seen locally? 6. What practical suggestions can improve balanced development?</w:t>
+      </w:r>
+    </w:p>
+    <w:p>
+      <w:pPr>
+        <w:spacing w:line="360" w:lineRule="auto" w:after="160"/>
+        <w:jc w:val="both"/>
+      </w:pPr>
+      <w:r>
+        <w:rPr>
+          <w:rFonts w:ascii="Times New Roman" w:hAnsi="Times New Roman"/>
+          <w:b w:val="0"/>
+          <w:sz w:val="24"/>
+        </w:rPr>
+        <w:t>C3. Notes - Summary of response: ____________________ - Actionable insight: ____________________</w:t>
+      </w:r>
+    </w:p>
+    <w:p>
+      <w:pPr>
+        <w:spacing w:line="360" w:lineRule="auto" w:after="160"/>
+        <w:jc w:val="both"/>
+      </w:pPr>
+      <w:r>
+        <w:rPr>
+          <w:rFonts w:ascii="Times New Roman" w:hAnsi="Times New Roman"/>
+          <w:b w:val="0"/>
+          <w:sz w:val="24"/>
+        </w:rPr>
+        <w:t>Annexure D: Structured Observation Checklist (Blank Format)</w:t>
+      </w:r>
+    </w:p>
+    <w:p>
+      <w:pPr>
+        <w:spacing w:line="360" w:lineRule="auto" w:after="160"/>
+        <w:jc w:val="both"/>
+      </w:pPr>
+      <w:r>
+        <w:rPr>
+          <w:rFonts w:ascii="Times New Roman" w:hAnsi="Times New Roman"/>
+          <w:b w:val="0"/>
+          <w:sz w:val="24"/>
+        </w:rPr>
+        <w:t>D1. Site Access and Arrival - Directional signage available and readable: Yes / No / Partly - Last-mile approach condition: Good / Average / Poor - Arrival guidance for first-time visitors: Good / Average / Poor</w:t>
+      </w:r>
+    </w:p>
+    <w:p>
+      <w:pPr>
+        <w:spacing w:line="360" w:lineRule="auto" w:after="160"/>
+        <w:jc w:val="both"/>
+      </w:pPr>
+      <w:r>
+        <w:rPr>
+          <w:rFonts w:ascii="Times New Roman" w:hAnsi="Times New Roman"/>
+          <w:b w:val="0"/>
+          <w:sz w:val="24"/>
+        </w:rPr>
+        <w:t>D2. On-site Visitor Environment - Cleanliness status: Good / Average / Poor - Waste handling visibility: Good / Average / Poor - Seating/rest support: Adequate / Limited / Not available - Behaviour guidance display: Clear / Partial / Absent</w:t>
+      </w:r>
+    </w:p>
+    <w:p>
+      <w:pPr>
+        <w:spacing w:line="360" w:lineRule="auto" w:after="160"/>
+        <w:jc w:val="both"/>
+      </w:pPr>
+      <w:r>
+        <w:rPr>
+          <w:rFonts w:ascii="Times New Roman" w:hAnsi="Times New Roman"/>
+          <w:b w:val="0"/>
+          <w:sz w:val="24"/>
+        </w:rPr>
+        <w:t>D3. Cultural Interpretation - Basic heritage information visible: Yes / No / Partly - Multilingual support available: Yes / No / Partly - Respectful photo/ritual guidance present: Yes / No / Partly</w:t>
+      </w:r>
+    </w:p>
+    <w:p>
+      <w:pPr>
+        <w:spacing w:line="360" w:lineRule="auto" w:after="160"/>
+        <w:jc w:val="both"/>
+      </w:pPr>
+      <w:r>
+        <w:rPr>
+          <w:rFonts w:ascii="Times New Roman" w:hAnsi="Times New Roman"/>
+          <w:b w:val="0"/>
+          <w:sz w:val="24"/>
+        </w:rPr>
+        <w:t>D4. Nearby Support Ecosystem - Transport support adequacy: Good / Average / Poor - Food/retail support quality: Good / Average / Poor - Overall visitor confidence impression: High / Medium / Low</w:t>
+      </w:r>
+    </w:p>
+    <w:p>
+      <w:pPr>
+        <w:spacing w:line="360" w:lineRule="auto" w:after="160"/>
+        <w:jc w:val="both"/>
+      </w:pPr>
+      <w:r>
+        <w:rPr>
+          <w:rFonts w:ascii="Times New Roman" w:hAnsi="Times New Roman"/>
+          <w:b w:val="0"/>
+          <w:sz w:val="24"/>
+        </w:rPr>
+        <w:t>D5. Field Note Closure - Date and time of observation: ____________________ - Peak/lean crowd condition: ____________________ - Most urgent improvement priority: ____________________</w:t>
       </w:r>
     </w:p>
     <w:sectPr>

</xml_diff>